<commit_message>
Added CS3201 DoublyLinkedList and Set 2 Q6.py
</commit_message>
<xml_diff>
--- a/Semester_6/PH3204 (Electronics Lab)/Experiment 3/Experiment 3.docx
+++ b/Semester_6/PH3204 (Electronics Lab)/Experiment 3/Experiment 3.docx
@@ -164,7 +164,15 @@
         </w:numPr>
       </w:pPr>
       <w:r>
-        <w:t>Ri = 1.0 KΩ , 4 Nos</w:t>
+        <w:t>Ri = 1.0 K</w:t>
+      </w:r>
+      <w:proofErr w:type="gramStart"/>
+      <w:r>
+        <w:t>Ω ,</w:t>
+      </w:r>
+      <w:proofErr w:type="gramEnd"/>
+      <w:r>
+        <w:t xml:space="preserve"> 4 Nos</w:t>
       </w:r>
     </w:p>
     <w:p>
@@ -345,14 +353,27 @@
                             <w:r>
                               <w:t xml:space="preserve">Figure </w:t>
                             </w:r>
-                            <w:fldSimple w:instr=" SEQ Figure \* ARABIC ">
-                              <w:r>
-                                <w:rPr>
-                                  <w:noProof/>
-                                </w:rPr>
-                                <w:t>1</w:t>
-                              </w:r>
-                            </w:fldSimple>
+                            <w:r>
+                              <w:fldChar w:fldCharType="begin"/>
+                            </w:r>
+                            <w:r>
+                              <w:instrText xml:space="preserve"> SEQ Figure \* ARABIC </w:instrText>
+                            </w:r>
+                            <w:r>
+                              <w:fldChar w:fldCharType="separate"/>
+                            </w:r>
+                            <w:r>
+                              <w:rPr>
+                                <w:noProof/>
+                              </w:rPr>
+                              <w:t>1</w:t>
+                            </w:r>
+                            <w:r>
+                              <w:rPr>
+                                <w:noProof/>
+                              </w:rPr>
+                              <w:fldChar w:fldCharType="end"/>
+                            </w:r>
                             <w:r>
                               <w:t xml:space="preserve">: (a) Symbolic representation of Op-Amp (b) Real 8-pin OPAMP showing how to count pin numbers (c) </w:t>
                             </w:r>
@@ -390,14 +411,27 @@
                       <w:r>
                         <w:t xml:space="preserve">Figure </w:t>
                       </w:r>
-                      <w:fldSimple w:instr=" SEQ Figure \* ARABIC ">
-                        <w:r>
-                          <w:rPr>
-                            <w:noProof/>
-                          </w:rPr>
-                          <w:t>1</w:t>
-                        </w:r>
-                      </w:fldSimple>
+                      <w:r>
+                        <w:fldChar w:fldCharType="begin"/>
+                      </w:r>
+                      <w:r>
+                        <w:instrText xml:space="preserve"> SEQ Figure \* ARABIC </w:instrText>
+                      </w:r>
+                      <w:r>
+                        <w:fldChar w:fldCharType="separate"/>
+                      </w:r>
+                      <w:r>
+                        <w:rPr>
+                          <w:noProof/>
+                        </w:rPr>
+                        <w:t>1</w:t>
+                      </w:r>
+                      <w:r>
+                        <w:rPr>
+                          <w:noProof/>
+                        </w:rPr>
+                        <w:fldChar w:fldCharType="end"/>
+                      </w:r>
                       <w:r>
                         <w:t xml:space="preserve">: (a) Symbolic representation of Op-Amp (b) Real 8-pin OPAMP showing how to count pin numbers (c) </w:t>
                       </w:r>
@@ -715,7 +749,15 @@
         </w:numPr>
       </w:pPr>
       <w:r>
-        <w:t>An OPAMP has very high “open-loop voltage gain” (ideally infinite); typically more than 10</w:t>
+        <w:t xml:space="preserve">An OPAMP has very high “open-loop voltage gain” (ideally infinite); </w:t>
+      </w:r>
+      <w:proofErr w:type="gramStart"/>
+      <w:r>
+        <w:t>typically</w:t>
+      </w:r>
+      <w:proofErr w:type="gramEnd"/>
+      <w:r>
+        <w:t xml:space="preserve"> more than 10</w:t>
       </w:r>
       <w:r>
         <w:rPr>
@@ -997,14 +1039,27 @@
       <w:r>
         <w:t xml:space="preserve">Figure </w:t>
       </w:r>
-      <w:fldSimple w:instr=" SEQ Figure \* ARABIC ">
-        <w:r>
-          <w:rPr>
-            <w:noProof/>
-          </w:rPr>
-          <w:t>2</w:t>
-        </w:r>
-      </w:fldSimple>
+      <w:r>
+        <w:fldChar w:fldCharType="begin"/>
+      </w:r>
+      <w:r>
+        <w:instrText xml:space="preserve"> SEQ Figure \* ARABIC </w:instrText>
+      </w:r>
+      <w:r>
+        <w:fldChar w:fldCharType="separate"/>
+      </w:r>
+      <w:r>
+        <w:rPr>
+          <w:noProof/>
+        </w:rPr>
+        <w:t>2</w:t>
+      </w:r>
+      <w:r>
+        <w:rPr>
+          <w:noProof/>
+        </w:rPr>
+        <w:fldChar w:fldCharType="end"/>
+      </w:r>
       <w:r>
         <w:t>: Op-Amp as an Inverting Amplifier</w:t>
       </w:r>
@@ -1332,14 +1387,27 @@
       <w:r>
         <w:t xml:space="preserve">Table </w:t>
       </w:r>
-      <w:fldSimple w:instr=" SEQ Table \* ARABIC ">
-        <w:r>
-          <w:rPr>
-            <w:noProof/>
-          </w:rPr>
-          <w:t>1</w:t>
-        </w:r>
-      </w:fldSimple>
+      <w:r>
+        <w:fldChar w:fldCharType="begin"/>
+      </w:r>
+      <w:r>
+        <w:instrText xml:space="preserve"> SEQ Table \* ARABIC </w:instrText>
+      </w:r>
+      <w:r>
+        <w:fldChar w:fldCharType="separate"/>
+      </w:r>
+      <w:r>
+        <w:rPr>
+          <w:noProof/>
+        </w:rPr>
+        <w:t>1</w:t>
+      </w:r>
+      <w:r>
+        <w:rPr>
+          <w:noProof/>
+        </w:rPr>
+        <w:fldChar w:fldCharType="end"/>
+      </w:r>
       <w:r>
         <w:t>: Inve</w:t>
       </w:r>
@@ -4492,14 +4560,27 @@
                             <w:r>
                               <w:t xml:space="preserve">Figure </w:t>
                             </w:r>
-                            <w:fldSimple w:instr=" SEQ Figure \* ARABIC ">
-                              <w:r>
-                                <w:rPr>
-                                  <w:noProof/>
-                                </w:rPr>
-                                <w:t>3</w:t>
-                              </w:r>
-                            </w:fldSimple>
+                            <w:r>
+                              <w:fldChar w:fldCharType="begin"/>
+                            </w:r>
+                            <w:r>
+                              <w:instrText xml:space="preserve"> SEQ Figure \* ARABIC </w:instrText>
+                            </w:r>
+                            <w:r>
+                              <w:fldChar w:fldCharType="separate"/>
+                            </w:r>
+                            <w:r>
+                              <w:rPr>
+                                <w:noProof/>
+                              </w:rPr>
+                              <w:t>3</w:t>
+                            </w:r>
+                            <w:r>
+                              <w:rPr>
+                                <w:noProof/>
+                              </w:rPr>
+                              <w:fldChar w:fldCharType="end"/>
+                            </w:r>
                             <w:r>
                               <w:t>: Op-Amp as a Non-Inverting Amplifier</w:t>
                             </w:r>
@@ -4531,14 +4612,27 @@
                       <w:r>
                         <w:t xml:space="preserve">Figure </w:t>
                       </w:r>
-                      <w:fldSimple w:instr=" SEQ Figure \* ARABIC ">
-                        <w:r>
-                          <w:rPr>
-                            <w:noProof/>
-                          </w:rPr>
-                          <w:t>3</w:t>
-                        </w:r>
-                      </w:fldSimple>
+                      <w:r>
+                        <w:fldChar w:fldCharType="begin"/>
+                      </w:r>
+                      <w:r>
+                        <w:instrText xml:space="preserve"> SEQ Figure \* ARABIC </w:instrText>
+                      </w:r>
+                      <w:r>
+                        <w:fldChar w:fldCharType="separate"/>
+                      </w:r>
+                      <w:r>
+                        <w:rPr>
+                          <w:noProof/>
+                        </w:rPr>
+                        <w:t>3</w:t>
+                      </w:r>
+                      <w:r>
+                        <w:rPr>
+                          <w:noProof/>
+                        </w:rPr>
+                        <w:fldChar w:fldCharType="end"/>
+                      </w:r>
                       <w:r>
                         <w:t>: Op-Amp as a Non-Inverting Amplifier</w:t>
                       </w:r>
@@ -4877,14 +4971,27 @@
       <w:r>
         <w:t xml:space="preserve">Table </w:t>
       </w:r>
-      <w:fldSimple w:instr=" SEQ Table \* ARABIC ">
-        <w:r>
-          <w:rPr>
-            <w:noProof/>
-          </w:rPr>
-          <w:t>2</w:t>
-        </w:r>
-      </w:fldSimple>
+      <w:r>
+        <w:fldChar w:fldCharType="begin"/>
+      </w:r>
+      <w:r>
+        <w:instrText xml:space="preserve"> SEQ Table \* ARABIC </w:instrText>
+      </w:r>
+      <w:r>
+        <w:fldChar w:fldCharType="separate"/>
+      </w:r>
+      <w:r>
+        <w:rPr>
+          <w:noProof/>
+        </w:rPr>
+        <w:t>2</w:t>
+      </w:r>
+      <w:r>
+        <w:rPr>
+          <w:noProof/>
+        </w:rPr>
+        <w:fldChar w:fldCharType="end"/>
+      </w:r>
       <w:r>
         <w:t>: Non-Inverting Amplifier Configuration</w:t>
       </w:r>
@@ -8299,14 +8406,27 @@
                             <w:r>
                               <w:t xml:space="preserve">Figure </w:t>
                             </w:r>
-                            <w:fldSimple w:instr=" SEQ Figure \* ARABIC ">
-                              <w:r>
-                                <w:rPr>
-                                  <w:noProof/>
-                                </w:rPr>
-                                <w:t>4</w:t>
-                              </w:r>
-                            </w:fldSimple>
+                            <w:r>
+                              <w:fldChar w:fldCharType="begin"/>
+                            </w:r>
+                            <w:r>
+                              <w:instrText xml:space="preserve"> SEQ Figure \* ARABIC </w:instrText>
+                            </w:r>
+                            <w:r>
+                              <w:fldChar w:fldCharType="separate"/>
+                            </w:r>
+                            <w:r>
+                              <w:rPr>
+                                <w:noProof/>
+                              </w:rPr>
+                              <w:t>4</w:t>
+                            </w:r>
+                            <w:r>
+                              <w:rPr>
+                                <w:noProof/>
+                              </w:rPr>
+                              <w:fldChar w:fldCharType="end"/>
+                            </w:r>
                             <w:r>
                               <w:t>: Op-Amp as an Adder</w:t>
                             </w:r>
@@ -8338,14 +8458,27 @@
                       <w:r>
                         <w:t xml:space="preserve">Figure </w:t>
                       </w:r>
-                      <w:fldSimple w:instr=" SEQ Figure \* ARABIC ">
-                        <w:r>
-                          <w:rPr>
-                            <w:noProof/>
-                          </w:rPr>
-                          <w:t>4</w:t>
-                        </w:r>
-                      </w:fldSimple>
+                      <w:r>
+                        <w:fldChar w:fldCharType="begin"/>
+                      </w:r>
+                      <w:r>
+                        <w:instrText xml:space="preserve"> SEQ Figure \* ARABIC </w:instrText>
+                      </w:r>
+                      <w:r>
+                        <w:fldChar w:fldCharType="separate"/>
+                      </w:r>
+                      <w:r>
+                        <w:rPr>
+                          <w:noProof/>
+                        </w:rPr>
+                        <w:t>4</w:t>
+                      </w:r>
+                      <w:r>
+                        <w:rPr>
+                          <w:noProof/>
+                        </w:rPr>
+                        <w:fldChar w:fldCharType="end"/>
+                      </w:r>
                       <w:r>
                         <w:t>: Op-Amp as an Adder</w:t>
                       </w:r>
@@ -8456,14 +8589,27 @@
       <w:r>
         <w:t xml:space="preserve">Table </w:t>
       </w:r>
-      <w:fldSimple w:instr=" SEQ Table \* ARABIC ">
-        <w:r>
-          <w:rPr>
-            <w:noProof/>
-          </w:rPr>
-          <w:t>3</w:t>
-        </w:r>
-      </w:fldSimple>
+      <w:r>
+        <w:fldChar w:fldCharType="begin"/>
+      </w:r>
+      <w:r>
+        <w:instrText xml:space="preserve"> SEQ Table \* ARABIC </w:instrText>
+      </w:r>
+      <w:r>
+        <w:fldChar w:fldCharType="separate"/>
+      </w:r>
+      <w:r>
+        <w:rPr>
+          <w:noProof/>
+        </w:rPr>
+        <w:t>3</w:t>
+      </w:r>
+      <w:r>
+        <w:rPr>
+          <w:noProof/>
+        </w:rPr>
+        <w:fldChar w:fldCharType="end"/>
+      </w:r>
       <w:r>
         <w:t>: Adder Configuration</w:t>
       </w:r>
@@ -10328,14 +10474,27 @@
                             <w:r>
                               <w:t xml:space="preserve">Figure </w:t>
                             </w:r>
-                            <w:fldSimple w:instr=" SEQ Figure \* ARABIC ">
-                              <w:r>
-                                <w:rPr>
-                                  <w:noProof/>
-                                </w:rPr>
-                                <w:t>5</w:t>
-                              </w:r>
-                            </w:fldSimple>
+                            <w:r>
+                              <w:fldChar w:fldCharType="begin"/>
+                            </w:r>
+                            <w:r>
+                              <w:instrText xml:space="preserve"> SEQ Figure \* ARABIC </w:instrText>
+                            </w:r>
+                            <w:r>
+                              <w:fldChar w:fldCharType="separate"/>
+                            </w:r>
+                            <w:r>
+                              <w:rPr>
+                                <w:noProof/>
+                              </w:rPr>
+                              <w:t>5</w:t>
+                            </w:r>
+                            <w:r>
+                              <w:rPr>
+                                <w:noProof/>
+                              </w:rPr>
+                              <w:fldChar w:fldCharType="end"/>
+                            </w:r>
                             <w:r>
                               <w:t>: Op-Amp as a subtractor</w:t>
                             </w:r>
@@ -10367,14 +10526,27 @@
                       <w:r>
                         <w:t xml:space="preserve">Figure </w:t>
                       </w:r>
-                      <w:fldSimple w:instr=" SEQ Figure \* ARABIC ">
-                        <w:r>
-                          <w:rPr>
-                            <w:noProof/>
-                          </w:rPr>
-                          <w:t>5</w:t>
-                        </w:r>
-                      </w:fldSimple>
+                      <w:r>
+                        <w:fldChar w:fldCharType="begin"/>
+                      </w:r>
+                      <w:r>
+                        <w:instrText xml:space="preserve"> SEQ Figure \* ARABIC </w:instrText>
+                      </w:r>
+                      <w:r>
+                        <w:fldChar w:fldCharType="separate"/>
+                      </w:r>
+                      <w:r>
+                        <w:rPr>
+                          <w:noProof/>
+                        </w:rPr>
+                        <w:t>5</w:t>
+                      </w:r>
+                      <w:r>
+                        <w:rPr>
+                          <w:noProof/>
+                        </w:rPr>
+                        <w:fldChar w:fldCharType="end"/>
+                      </w:r>
                       <w:r>
                         <w:t>: Op-Amp as a subtractor</w:t>
                       </w:r>
@@ -10413,14 +10585,27 @@
       <w:r>
         <w:t xml:space="preserve">Table </w:t>
       </w:r>
-      <w:fldSimple w:instr=" SEQ Table \* ARABIC ">
-        <w:r>
-          <w:rPr>
-            <w:noProof/>
-          </w:rPr>
-          <w:t>4</w:t>
-        </w:r>
-      </w:fldSimple>
+      <w:r>
+        <w:fldChar w:fldCharType="begin"/>
+      </w:r>
+      <w:r>
+        <w:instrText xml:space="preserve"> SEQ Table \* ARABIC </w:instrText>
+      </w:r>
+      <w:r>
+        <w:fldChar w:fldCharType="separate"/>
+      </w:r>
+      <w:r>
+        <w:rPr>
+          <w:noProof/>
+        </w:rPr>
+        <w:t>4</w:t>
+      </w:r>
+      <w:r>
+        <w:rPr>
+          <w:noProof/>
+        </w:rPr>
+        <w:fldChar w:fldCharType="end"/>
+      </w:r>
       <w:r>
         <w:t>: Subtractor Configuration</w:t>
       </w:r>
@@ -11678,13 +11863,7 @@
           <w:rPr>
             <w:rFonts w:ascii="Cambria Math" w:hAnsi="Cambria Math"/>
           </w:rPr>
-          <m:t>±</m:t>
-        </m:r>
-        <m:r>
-          <w:rPr>
-            <w:rFonts w:ascii="Cambria Math" w:hAnsi="Cambria Math"/>
-          </w:rPr>
-          <m:t xml:space="preserve"> 15V)</m:t>
+          <m:t>± 15V)</m:t>
         </m:r>
       </m:oMath>
       <w:r>

</xml_diff>